<commit_message>
Update pair #01 ANALYSIS to reference current Model A output filename
leadlag_event_unified_results.csv was archived; the equivalent output is
now leadlag_event_unified_kalshi_etf.csv with identical schema.
</commit_message>
<xml_diff>
--- a/leadlag/pair_analyses/01_fed_nov_h0__vde/ANALYSIS.docx
+++ b/leadlag/pair_analyses/01_fed_nov_h0__vde/ANALYSIS.docx
@@ -207,7 +207,7 @@
     </w:p>
     <w:p>
       <w:r>
-        <w:t>Out of the 14 contracts × multiple ETFs with credible regression results in leadlag_event_unified_results.csv, this pair scores best on six dimensions:</w:t>
+        <w:t>Out of the 14 contracts × multiple ETFs with credible regression results in leadlag_event_unified_kalshi_etf.csv, this pair scores best on six dimensions:</w:t>
       </w:r>
     </w:p>
     <w:tbl>
@@ -1331,7 +1331,7 @@
           </w:tcPr>
           <w:p>
             <w:r>
-              <w:t>leadlag_event_unified_results.csv</w:t>
+              <w:t>leadlag_event_unified_kalshi_etf.csv</w:t>
             </w:r>
           </w:p>
         </w:tc>

</xml_diff>